<commit_message>
B-02 auto: data/miejsce diagnozy, poziomy 1-3 (przewaga niskich), opisy cz.III, box IPZS, zespol diagnozujacy
</commit_message>
<xml_diff>
--- a/public/wzory/CIS_B-02_Arkusz_diagnozy_kompleksowej.docx
+++ b/public/wzory/CIS_B-02_Arkusz_diagnozy_kompleksowej.docx
@@ -374,7 +374,7 @@
                 <w:sz w:val="19"/>
                 <w:szCs w:val="19"/>
               </w:rPr>
-              <w:t xml:space="preserve"/>
+              <w:t>{{data_diagnozy}}</w:t>
             </w:r>
           </w:p>
         </w:tc>
@@ -442,7 +442,7 @@
                 <w:sz w:val="19"/>
                 <w:szCs w:val="19"/>
               </w:rPr>
-              <w:t xml:space="preserve"/>
+              <w:t>{{miejsce_diagnozy}}</w:t>
             </w:r>
           </w:p>
         </w:tc>
@@ -746,7 +746,7 @@
                 <w:sz w:val="19"/>
                 <w:szCs w:val="19"/>
               </w:rPr>
-              <w:t xml:space="preserve"> </w:t>
+              <w:t>{{poz1}}</w:t>
             </w:r>
           </w:p>
         </w:tc>
@@ -880,7 +880,7 @@
                 <w:sz w:val="19"/>
                 <w:szCs w:val="19"/>
               </w:rPr>
-              <w:t xml:space="preserve"> </w:t>
+              <w:t>{{poz2}}</w:t>
             </w:r>
           </w:p>
         </w:tc>
@@ -1014,7 +1014,7 @@
                 <w:sz w:val="19"/>
                 <w:szCs w:val="19"/>
               </w:rPr>
-              <w:t xml:space="preserve"> </w:t>
+              <w:t>{{poz3}}</w:t>
             </w:r>
           </w:p>
         </w:tc>
@@ -1148,7 +1148,7 @@
                 <w:sz w:val="19"/>
                 <w:szCs w:val="19"/>
               </w:rPr>
-              <w:t xml:space="preserve"> </w:t>
+              <w:t>{{poz4}}</w:t>
             </w:r>
           </w:p>
         </w:tc>
@@ -1467,7 +1467,7 @@
                 <w:sz w:val="19"/>
                 <w:szCs w:val="19"/>
               </w:rPr>
-              <w:t xml:space="preserve"> </w:t>
+              <w:t>{{poz5}}</w:t>
             </w:r>
           </w:p>
         </w:tc>
@@ -1601,7 +1601,7 @@
                 <w:sz w:val="19"/>
                 <w:szCs w:val="19"/>
               </w:rPr>
-              <w:t xml:space="preserve"> </w:t>
+              <w:t>{{poz6}}</w:t>
             </w:r>
           </w:p>
         </w:tc>
@@ -1735,7 +1735,7 @@
                 <w:sz w:val="19"/>
                 <w:szCs w:val="19"/>
               </w:rPr>
-              <w:t xml:space="preserve"> </w:t>
+              <w:t>{{poz7}}</w:t>
             </w:r>
           </w:p>
         </w:tc>
@@ -1869,7 +1869,7 @@
                 <w:sz w:val="19"/>
                 <w:szCs w:val="19"/>
               </w:rPr>
-              <w:t xml:space="preserve"> </w:t>
+              <w:t>{{poz8}}</w:t>
             </w:r>
           </w:p>
         </w:tc>
@@ -2003,7 +2003,7 @@
                 <w:sz w:val="19"/>
                 <w:szCs w:val="19"/>
               </w:rPr>
-              <w:t xml:space="preserve"> </w:t>
+              <w:t>{{poz9}}</w:t>
             </w:r>
           </w:p>
         </w:tc>
@@ -2322,7 +2322,7 @@
                 <w:sz w:val="19"/>
                 <w:szCs w:val="19"/>
               </w:rPr>
-              <w:t xml:space="preserve"> </w:t>
+              <w:t>{{poz10}}</w:t>
             </w:r>
           </w:p>
         </w:tc>
@@ -2456,7 +2456,7 @@
                 <w:sz w:val="19"/>
                 <w:szCs w:val="19"/>
               </w:rPr>
-              <w:t xml:space="preserve"> </w:t>
+              <w:t>{{poz11}}</w:t>
             </w:r>
           </w:p>
         </w:tc>
@@ -2590,7 +2590,7 @@
                 <w:sz w:val="19"/>
                 <w:szCs w:val="19"/>
               </w:rPr>
-              <w:t xml:space="preserve"> </w:t>
+              <w:t>{{poz12}}</w:t>
             </w:r>
           </w:p>
         </w:tc>
@@ -2909,7 +2909,7 @@
                 <w:sz w:val="19"/>
                 <w:szCs w:val="19"/>
               </w:rPr>
-              <w:t xml:space="preserve"> </w:t>
+              <w:t>{{poz13}}</w:t>
             </w:r>
           </w:p>
         </w:tc>
@@ -3043,7 +3043,7 @@
                 <w:sz w:val="19"/>
                 <w:szCs w:val="19"/>
               </w:rPr>
-              <w:t xml:space="preserve"> </w:t>
+              <w:t>{{poz14}}</w:t>
             </w:r>
           </w:p>
         </w:tc>
@@ -3177,7 +3177,7 @@
                 <w:sz w:val="19"/>
                 <w:szCs w:val="19"/>
               </w:rPr>
-              <w:t xml:space="preserve"> </w:t>
+              <w:t>{{poz15}}</w:t>
             </w:r>
           </w:p>
         </w:tc>
@@ -3496,7 +3496,7 @@
                 <w:sz w:val="19"/>
                 <w:szCs w:val="19"/>
               </w:rPr>
-              <w:t xml:space="preserve"> </w:t>
+              <w:t>{{poz16}}</w:t>
             </w:r>
           </w:p>
         </w:tc>
@@ -3630,7 +3630,7 @@
                 <w:sz w:val="19"/>
                 <w:szCs w:val="19"/>
               </w:rPr>
-              <w:t xml:space="preserve"> </w:t>
+              <w:t>{{poz17}}</w:t>
             </w:r>
           </w:p>
         </w:tc>
@@ -3764,7 +3764,7 @@
                 <w:sz w:val="19"/>
                 <w:szCs w:val="19"/>
               </w:rPr>
-              <w:t xml:space="preserve"> </w:t>
+              <w:t>{{poz18}}</w:t>
             </w:r>
           </w:p>
         </w:tc>
@@ -3835,7 +3835,7 @@
           <w:sz w:val="20"/>
           <w:szCs w:val="20"/>
         </w:rPr>
-        <w:t xml:space="preserve">Główne zidentyfikowane bariery i deficyty:</w:t>
+        <w:t>Główne zidentyfikowane bariery i deficyty:  {{bariery}}</w:t>
       </w:r>
       <w:r>
         <w:rPr>
@@ -3847,7 +3847,6 @@
           <w:sz w:val="20"/>
           <w:szCs w:val="20"/>
         </w:rPr>
-        <w:t xml:space="preserve">  ……………………………………………………………………</w:t>
       </w:r>
     </w:p>
     <w:p>
@@ -3864,7 +3863,6 @@
           <w:sz w:val="20"/>
           <w:szCs w:val="20"/>
         </w:rPr>
-        <w:t xml:space="preserve"> </w:t>
       </w:r>
       <w:r>
         <w:rPr>
@@ -3876,7 +3874,6 @@
           <w:sz w:val="20"/>
           <w:szCs w:val="20"/>
         </w:rPr>
-        <w:t xml:space="preserve">  ……………………………………………………………………</w:t>
       </w:r>
     </w:p>
     <w:p>
@@ -3893,7 +3890,7 @@
           <w:sz w:val="20"/>
           <w:szCs w:val="20"/>
         </w:rPr>
-        <w:t xml:space="preserve">Mocne strony i zasoby uczestnika:</w:t>
+        <w:t>Mocne strony i zasoby uczestnika:  {{mocne}}</w:t>
       </w:r>
       <w:r>
         <w:rPr>
@@ -3905,7 +3902,6 @@
           <w:sz w:val="20"/>
           <w:szCs w:val="20"/>
         </w:rPr>
-        <w:t xml:space="preserve">  ……………………………………………………………………</w:t>
       </w:r>
     </w:p>
     <w:p>
@@ -3922,7 +3918,6 @@
           <w:sz w:val="20"/>
           <w:szCs w:val="20"/>
         </w:rPr>
-        <w:t xml:space="preserve"> </w:t>
       </w:r>
       <w:r>
         <w:rPr>
@@ -3934,7 +3929,6 @@
           <w:sz w:val="20"/>
           <w:szCs w:val="20"/>
         </w:rPr>
-        <w:t xml:space="preserve">  ……………………………………………………………………</w:t>
       </w:r>
     </w:p>
     <w:p>
@@ -3951,7 +3945,7 @@
           <w:sz w:val="20"/>
           <w:szCs w:val="20"/>
         </w:rPr>
-        <w:t xml:space="preserve">Rekomendowane formy wsparcia (reintegracja społeczna / zawodowa, kursy):</w:t>
+        <w:t>Rekomendowane formy wsparcia (reintegracja społeczna / zawodowa, kursy):  {{rekomendacje}}</w:t>
       </w:r>
       <w:r>
         <w:rPr>
@@ -3963,7 +3957,6 @@
           <w:sz w:val="20"/>
           <w:szCs w:val="20"/>
         </w:rPr>
-        <w:t xml:space="preserve">  ……………………………………………………………………</w:t>
       </w:r>
     </w:p>
     <w:p>
@@ -3980,7 +3973,6 @@
           <w:sz w:val="20"/>
           <w:szCs w:val="20"/>
         </w:rPr>
-        <w:t xml:space="preserve"> </w:t>
       </w:r>
       <w:r>
         <w:rPr>
@@ -3992,7 +3984,6 @@
           <w:sz w:val="20"/>
           <w:szCs w:val="20"/>
         </w:rPr>
-        <w:t xml:space="preserve">  ……………………………………………………………………</w:t>
       </w:r>
     </w:p>
     <w:p>
@@ -4027,7 +4018,7 @@
           <w:sz w:val="20"/>
           <w:szCs w:val="20"/>
         </w:rPr>
-        <w:t xml:space="preserve">☐  w formie Indywidualnego Programu Zatrudnienia Socjalnego (IPZS) — uczestnik CIS</w:t>
+        <w:t>☒  w formie Indywidualnego Programu Zatrudnienia Socjalnego (IPZS) — uczestnik CIS</w:t>
       </w:r>
     </w:p>
     <w:p>
@@ -4259,7 +4250,7 @@
                 <w:sz w:val="18"/>
                 <w:szCs w:val="18"/>
               </w:rPr>
-              <w:t xml:space="preserve"/>
+              <w:t>Jan Kostyszak</w:t>
             </w:r>
           </w:p>
         </w:tc>
@@ -4360,7 +4351,7 @@
                 <w:sz w:val="18"/>
                 <w:szCs w:val="18"/>
               </w:rPr>
-              <w:t xml:space="preserve"/>
+              <w:t>Korina Łukaszkiewicz</w:t>
             </w:r>
           </w:p>
         </w:tc>
@@ -4461,7 +4452,7 @@
                 <w:sz w:val="18"/>
                 <w:szCs w:val="18"/>
               </w:rPr>
-              <w:t xml:space="preserve"/>
+              <w:t>Ewa Milejska</w:t>
             </w:r>
           </w:p>
         </w:tc>
@@ -4562,7 +4553,7 @@
                 <w:sz w:val="18"/>
                 <w:szCs w:val="18"/>
               </w:rPr>
-              <w:t xml:space="preserve"/>
+              <w:t>Agnieszka Szuchnik</w:t>
             </w:r>
           </w:p>
         </w:tc>

</xml_diff>

<commit_message>
B-02: usuniecie dolnej linii podpisu uczestnika i daty (podpisy zespolu w czesci IV, data w czesci I)
</commit_message>
<xml_diff>
--- a/public/wzory/CIS_B-02_Arkusz_diagnozy_kompleksowej.docx
+++ b/public/wzory/CIS_B-02_Arkusz_diagnozy_kompleksowej.docx
@@ -4592,40 +4592,6 @@
         </w:tc>
       </w:tr>
     </w:tbl>
-    <w:p>
-      <w:pPr>
-        <w:spacing w:after="40" w:before="240"/>
-      </w:pPr>
-      <w:r>
-        <w:rPr>
-          <w:b w:val="false"/>
-          <w:bCs w:val="false"/>
-          <w:i w:val="false"/>
-          <w:iCs w:val="false"/>
-          <w:color w:val="000000"/>
-          <w:sz w:val="18"/>
-          <w:szCs w:val="18"/>
-        </w:rPr>
-        <w:t xml:space="preserve">…………………………………                                   …………………………………</w:t>
-      </w:r>
-    </w:p>
-    <w:p>
-      <w:pPr>
-        <w:spacing w:after="40" w:before="40"/>
-      </w:pPr>
-      <w:r>
-        <w:rPr>
-          <w:b w:val="false"/>
-          <w:bCs w:val="false"/>
-          <w:i w:val="false"/>
-          <w:iCs w:val="false"/>
-          <w:color w:val="000000"/>
-          <w:sz w:val="15"/>
-          <w:szCs w:val="15"/>
-        </w:rPr>
-        <w:t xml:space="preserve">        data i podpis uczestnika/uczestniczki                                  data sporządzenia diagnozy</w:t>
-      </w:r>
-    </w:p>
     <w:sectPr>
       <w:headerReference w:type="default" r:id="rId7"/>
       <w:footerReference w:type="default" r:id="rId8"/>

</xml_diff>

<commit_message>
Ujednolic sekcje III i IV formularza B-02
</commit_message>
<xml_diff>
--- a/public/wzory/CIS_B-02_Arkusz_diagnozy_kompleksowej.docx
+++ b/public/wzory/CIS_B-02_Arkusz_diagnozy_kompleksowej.docx
@@ -3598,29 +3598,16 @@
     </w:p>
     <w:p>
       <w:pPr>
-        <w:spacing w:before="20" w:after="20"/>
-        <w:ind w:left="200"/>
-        <w:rPr>
-          <w:color w:val="000000"/>
-          <w:sz w:val="20"/>
-          <w:szCs w:val="20"/>
-        </w:rPr>
+        <w:shd w:val="clear" w:color="auto" w:fill="D9E2F3"/>
+        <w:spacing w:before="150" w:after="70"/>
       </w:pPr>
       <w:r>
         <w:rPr>
-          <w:color w:val="000000"/>
-          <w:sz w:val="20"/>
-          <w:szCs w:val="20"/>
+          <w:b/>
+          <w:bCs/>
+          <w:color w:val="1F4E79"/>
         </w:rPr>
-        <w:t>IV.</w:t>
-      </w:r>
-      <w:r>
-        <w:rPr>
-          <w:color w:val="000000"/>
-          <w:sz w:val="20"/>
-          <w:szCs w:val="20"/>
-        </w:rPr>
-        <w:t xml:space="preserve"> POTWIERDZENIE WYKONANIA DIAGNOZY</w:t>
+        <w:t>CZĘŚĆ IV. POTWIERDZENIE WYKONANIA DIAGNOZY</w:t>
       </w:r>
     </w:p>
     <w:p>

</xml_diff>

<commit_message>
Popraw kolor naglowkow tabeli w B-02
</commit_message>
<xml_diff>
--- a/public/wzory/CIS_B-02_Arkusz_diagnozy_kompleksowej.docx
+++ b/public/wzory/CIS_B-02_Arkusz_diagnozy_kompleksowej.docx
@@ -3738,7 +3738,7 @@
               <w:rPr>
                 <w:b/>
                 <w:bCs/>
-                <w:color w:val="000000"/>
+                <w:color w:val="FFFFFF"/>
                 <w:sz w:val="18"/>
                 <w:szCs w:val="18"/>
               </w:rPr>
@@ -3772,7 +3772,7 @@
               <w:rPr>
                 <w:b/>
                 <w:bCs/>
-                <w:color w:val="000000"/>
+                <w:color w:val="FFFFFF"/>
                 <w:sz w:val="18"/>
                 <w:szCs w:val="18"/>
               </w:rPr>

</xml_diff>